<commit_message>
Notebook coding is completed
</commit_message>
<xml_diff>
--- a/report/id26s012_assignment1_report.docx
+++ b/report/id26s012_assignment1_report.docx
@@ -131,11 +131,19 @@
         </w:rPr>
         <w:t xml:space="preserve">These images are taken </w:t>
       </w:r>
+      <w:proofErr w:type="spellStart"/>
       <w:r>
         <w:rPr>
           <w:rFonts w:ascii="Times New Roman" w:hAnsi="Times New Roman" w:cs="Times New Roman"/>
         </w:rPr>
-        <w:t>infront of ANRF National Facility for Cryo-Electron Microscopy Building at IIT Madras Campus with Samsung Galaxy S24 Ultra.</w:t>
+        <w:t>infront</w:t>
+      </w:r>
+      <w:proofErr w:type="spellEnd"/>
+      <w:r>
+        <w:rPr>
+          <w:rFonts w:ascii="Times New Roman" w:hAnsi="Times New Roman" w:cs="Times New Roman"/>
+        </w:rPr>
+        <w:t xml:space="preserve"> of ANRF National Facility for Cryo-Electron Microscopy Building at IIT Madras Campus with Samsung Galaxy S24 Ultra.</w:t>
       </w:r>
     </w:p>
     <w:tbl>
@@ -1812,6 +1820,28 @@
 </a:theme>
 </file>
 
+<file path=word/webextensions/taskpanes.xml><?xml version="1.0" encoding="utf-8"?>
+<wetp:taskpanes xmlns:wetp="http://schemas.microsoft.com/office/webextensions/taskpanes/2010/11">
+  <wetp:taskpane dockstate="right" visibility="0" width="525" row="0">
+    <wetp:webextensionref xmlns:r="http://schemas.openxmlformats.org/officeDocument/2006/relationships" r:id="rId1"/>
+  </wetp:taskpane>
+</wetp:taskpanes>
+</file>
+
+<file path=word/webextensions/webextension1.xml><?xml version="1.0" encoding="utf-8"?>
+<we:webextension xmlns:we="http://schemas.microsoft.com/office/webextensions/webextension/2010/11" id="{BB1BF2D0-79FA-4B0E-AECB-112C6A4161A1}">
+  <we:reference id="wa104382081" version="1.55.1.0" store="en-US" storeType="OMEX"/>
+  <we:alternateReferences>
+    <we:reference id="WA104382081" version="1.55.1.0" store="" storeType="OMEX"/>
+  </we:alternateReferences>
+  <we:properties>
+    <we:property name="MENDELEY_CITATIONS" value="[]"/>
+  </we:properties>
+  <we:bindings/>
+  <we:snapshot xmlns:r="http://schemas.openxmlformats.org/officeDocument/2006/relationships"/>
+</we:webextension>
+</file>
+
 <file path=customXml/item1.xml><?xml version="1.0" encoding="utf-8"?>
 <b:Sources xmlns:b="http://schemas.openxmlformats.org/officeDocument/2006/bibliography" xmlns="http://schemas.openxmlformats.org/officeDocument/2006/bibliography" SelectedStyle="\APASixthEditionOfficeOnline.xsl" StyleName="APA" Version="6"/>
 </file>

</xml_diff>